<commit_message>
R1 is one pallet across (confirmed); rebuild workbooks
Co-Authored-By: Claude Opus 5.5 <noreply@anthropic.com>
Claude-Session: https://claude.ai/code/session_01PaVB5ZWiX4HH2k96Bt3cJ6
</commit_message>
<xml_diff>
--- a/How_To_Use_Floor_Map.docx
+++ b/How_To_Use_Floor_Map.docx
@@ -2047,7 +2047,7 @@
                 <w:sz w:val="20"/>
                 <w:szCs w:val="20"/>
               </w:rPr>
-              <w:t xml:space="preserve">The starting sizes come from your floor sketch. Please check that </w:t>
+              <w:t xml:space="preserve">The starting sizes come from your floor sketch. </w:t>
             </w:r>
             <w:r>
               <w:rPr>
@@ -2065,7 +2065,7 @@
                 <w:sz w:val="20"/>
                 <w:szCs w:val="20"/>
               </w:rPr>
-              <w:t xml:space="preserve"> (the narrow aisle) is 2 across and that </w:t>
+              <w:t xml:space="preserve"> (the narrow aisle) is 1 across. Please check that </w:t>
             </w:r>
             <w:r>
               <w:rPr>

</xml_diff>